<commit_message>
docs(seo): note /geo UI for AEO Audit panel + extended-engines toggle
Co-Authored-By: Claude Opus 4.8 (1M context) <noreply@anthropic.com>
</commit_message>
<xml_diff>
--- a/PRODUCTS/04-seo-agent.docx
+++ b/PRODUCTS/04-seo-agent.docx
@@ -9027,6 +9027,57 @@
               </w:rPr>
               <w:t>7 מנועים</w:t>
             </w:r>
+            <w:r>
+              <w:rPr>
+                <w:rFonts w:ascii="Arial" w:hAnsi="Arial"/>
+                <w:b w:val="0"/>
+                <w:sz w:val="20"/>
+                <w:rtl w:val="1"/>
+                <w:rFonts w:cs="Arial"/>
+              </w:rPr>
+              <w:t xml:space="preserve">; </w:t>
+            </w:r>
+            <w:r>
+              <w:rPr>
+                <w:rFonts w:ascii="Arial" w:hAnsi="Arial"/>
+                <w:b/>
+                <w:sz w:val="20"/>
+                <w:rtl w:val="1"/>
+                <w:rFonts w:cs="Arial"/>
+              </w:rPr>
+              <w:t>צ'קבוקס "מנועים מורחבים" ב-UI</w:t>
+            </w:r>
+            <w:r>
+              <w:rPr>
+                <w:rFonts w:ascii="Arial" w:hAnsi="Arial"/>
+                <w:b w:val="0"/>
+                <w:sz w:val="20"/>
+                <w:rtl w:val="1"/>
+                <w:rFonts w:cs="Arial"/>
+              </w:rPr>
+              <w:t xml:space="preserve"> של </w:t>
+            </w:r>
+            <w:r>
+              <w:rPr>
+                <w:rFonts w:ascii="Consolas" w:hAnsi="Consolas"/>
+                <w:b w:val="0"/>
+                <w:color w:val="B02A37"/>
+                <w:sz w:val="20"/>
+                <w:rtl w:val="1"/>
+                <w:rFonts w:cs="Consolas"/>
+              </w:rPr>
+              <w:t>/geo</w:t>
+            </w:r>
+            <w:r>
+              <w:rPr>
+                <w:rFonts w:ascii="Arial" w:hAnsi="Arial"/>
+                <w:b w:val="0"/>
+                <w:sz w:val="20"/>
+                <w:rtl w:val="1"/>
+                <w:rFonts w:cs="Arial"/>
+              </w:rPr>
+              <w:t xml:space="preserve"> (opt-in)</w:t>
+            </w:r>
           </w:p>
         </w:tc>
         <w:tc>
@@ -9069,6 +9120,27 @@
                 <w:rFonts w:cs="Consolas"/>
               </w:rPr>
               <w:t>lib/geo/engines</w:t>
+            </w:r>
+            <w:r>
+              <w:rPr>
+                <w:rFonts w:ascii="Arial" w:hAnsi="Arial"/>
+                <w:b w:val="0"/>
+                <w:sz w:val="20"/>
+                <w:rtl w:val="1"/>
+                <w:rFonts w:cs="Arial"/>
+              </w:rPr>
+              <w:t xml:space="preserve">, </w:t>
+            </w:r>
+            <w:r>
+              <w:rPr>
+                <w:rFonts w:ascii="Consolas" w:hAnsi="Consolas"/>
+                <w:b w:val="0"/>
+                <w:color w:val="B02A37"/>
+                <w:sz w:val="20"/>
+                <w:rtl w:val="1"/>
+                <w:rFonts w:cs="Consolas"/>
+              </w:rPr>
+              <w:t>app/geo</w:t>
             </w:r>
           </w:p>
         </w:tc>
@@ -9101,7 +9173,27 @@
                 <w:rtl w:val="1"/>
                 <w:rFonts w:cs="Arial"/>
               </w:rPr>
-              <w:t xml:space="preserve"> — ציון מוכנות-לציטוט per-URL (11 בדיקות: llms.txt/robots-AI/sitemap/JSON-LD/FAQ/meta/canonical/BLUF/headings), עברית</w:t>
+              <w:t xml:space="preserve"> — ציון מוכנות-לציטוט per-URL (11 בדיקות: llms.txt/robots-AI/sitemap/JSON-LD/FAQ/meta/canonical/BLUF/headings), עברית; </w:t>
+            </w:r>
+            <w:r>
+              <w:rPr>
+                <w:rFonts w:ascii="Arial" w:hAnsi="Arial"/>
+                <w:b/>
+                <w:sz w:val="20"/>
+                <w:rtl w:val="1"/>
+                <w:rFonts w:cs="Arial"/>
+              </w:rPr>
+              <w:t>פאנל UI מלא ב-`/geo`</w:t>
+            </w:r>
+            <w:r>
+              <w:rPr>
+                <w:rFonts w:ascii="Arial" w:hAnsi="Arial"/>
+                <w:b w:val="0"/>
+                <w:sz w:val="20"/>
+                <w:rtl w:val="1"/>
+                <w:rFonts w:cs="Arial"/>
+              </w:rPr>
+              <w:t xml:space="preserve"> (ציון + בדיקות מקובצות גילוי/מבנה/תוכן)</w:t>
             </w:r>
           </w:p>
         </w:tc>
@@ -9145,6 +9237,27 @@
                 <w:rFonts w:cs="Consolas"/>
               </w:rPr>
               <w:t>/api/aeo-audit</w:t>
+            </w:r>
+            <w:r>
+              <w:rPr>
+                <w:rFonts w:ascii="Arial" w:hAnsi="Arial"/>
+                <w:b w:val="0"/>
+                <w:sz w:val="20"/>
+                <w:rtl w:val="1"/>
+                <w:rFonts w:cs="Arial"/>
+              </w:rPr>
+              <w:t xml:space="preserve">, </w:t>
+            </w:r>
+            <w:r>
+              <w:rPr>
+                <w:rFonts w:ascii="Consolas" w:hAnsi="Consolas"/>
+                <w:b w:val="0"/>
+                <w:color w:val="B02A37"/>
+                <w:sz w:val="20"/>
+                <w:rtl w:val="1"/>
+                <w:rFonts w:cs="Consolas"/>
+              </w:rPr>
+              <w:t>app/geo</w:t>
             </w:r>
           </w:p>
         </w:tc>

</xml_diff>

<commit_message>
feat: HELIX Guard on readiness landing + @helix/prompts kit + product docs
- app/startups/readiness: Guard as GET item #07, unlocked post-connection to STAGE
- lib/prompt-kit.ts: shared structured-prompt scaffold (@helix/prompts convention,
  ported from PromptForge: role→inputs→workflow→constraints→output-contract)
- lib/content-tool.ts: all 3 prompts refactored onto prompt-kit (JSON contracts unchanged)
- PRODUCTS: 09-helix-guard (new product spec), PROMPTFORGE-ANALYSIS (new),
  04-seo-agent §13.6 act-engine built, external-connections xlsx act-loop row

typecheck green.

Co-Authored-By: Claude Opus 4.8 (1M context) <noreply@anthropic.com>
</commit_message>
<xml_diff>
--- a/PRODUCTS/04-seo-agent.docx
+++ b/PRODUCTS/04-seo-agent.docx
@@ -16532,6 +16532,717 @@
           <w:rtl w:val="1"/>
         </w:rPr>
         <w:t>להגדרה (env/Meta, לא קוד): להגדיר את ה-verify-token, לרשום את ה-webhook ב-Meta עם subscription ל-messages, ולוודא credentials של וואטסאפ. חובה מספר בפורמט בינלאומי מלא — 050… לא יתאים ל-wa_id.</w:t>
+      </w:r>
+    </w:p>
+    <w:p>
+      <w:r>
+        <w:br w:type="page"/>
+      </w:r>
+    </w:p>
+    <w:p>
+      <w:pPr>
+        <w:pStyle w:val="Heading1"/>
+        <w:jc w:val="right"/>
+        <w:bidi/>
+      </w:pPr>
+      <w:r>
+        <w:rPr>
+          <w:rtl w:val="1"/>
+        </w:rPr>
+        <w:t>13. אינטגרציית seo-god — Steal-List (נבדק 2026-08-07)</w:t>
+      </w:r>
+    </w:p>
+    <w:p>
+      <w:pPr>
+        <w:jc w:val="right"/>
+        <w:bidi/>
+      </w:pPr>
+      <w:r>
+        <w:rPr>
+          <w:b w:val="0"/>
+          <w:rtl w:val="1"/>
+        </w:rPr>
+        <w:t>נסקר הריפו github.com/Freespirits/seo-god — לא מוצר ולא מתחרה, אלא Claude Code Skill: סוכן SEO אוטונומי שרץ על ה-repo של אתר שאתה מחזיק (crawl מקומי דרך OpenSEO/Docker → audit → GSC diff → תיקון קוד → תזמון יומי). מותקן אצלנו ב-~/.claude/skills/seo-god. הערך שלו לא בפיצ'רים (Rank כבר עשיר יותר) אלא באדריכלות ה-agentic loop — בדיוק הפריט שנשאר פתוח ב-§3.99: cron/אוטונומיה.</w:t>
+      </w:r>
+    </w:p>
+    <w:p>
+      <w:pPr>
+        <w:pStyle w:val="Heading2"/>
+        <w:jc w:val="right"/>
+        <w:bidi/>
+      </w:pPr>
+      <w:r>
+        <w:rPr>
+          <w:rtl w:val="1"/>
+        </w:rPr>
+        <w:t>13.1 שלושת הדברים לגנוב</w:t>
+      </w:r>
+    </w:p>
+    <w:p>
+      <w:pPr>
+        <w:pStyle w:val="ListBullet"/>
+        <w:jc w:val="right"/>
+        <w:bidi/>
+      </w:pPr>
+      <w:r>
+        <w:rPr>
+          <w:rtl w:val="1"/>
+        </w:rPr>
+        <w:t>לולאת act היומית עם build-gate (references/act.md): סדר קשיח inputs → may we edit? → regressions → quick wins → content gap → readout. כל batch עריכה רץ מאחורי build_cmd; בילד נשבר → משחזר רק את ה-batch ועוצר. אף פעם לא commit. מזין את Citation-Gap→Patch (§3.5.1) ואת Content Watchdog (§3.8.7).</w:t>
+      </w:r>
+    </w:p>
+    <w:p>
+      <w:pPr>
+        <w:pStyle w:val="ListBullet"/>
+        <w:jc w:val="right"/>
+        <w:bidi/>
+      </w:pPr>
+      <w:r>
+        <w:rPr>
+          <w:rtl w:val="1"/>
+        </w:rPr>
+        <w:t>Quick-win targeting לפוזיציות 4–15 (act.md §4): 2–3 עמודים/ריצה, 4 מהלכים לכל עמוד — title keyword-led ~60 תווים, TL;DR 40–70 מילים אחרי H1, 2–4 FAQ בצורת שאלה, 1–3 קישורים פנימיים נכנסים. אף פעם לא דף חדש/כפול. זה ה-Striking Distance שלנו (§3.9 #1) עם פעולת-תיקון מוגדרת.</w:t>
+      </w:r>
+    </w:p>
+    <w:p>
+      <w:pPr>
+        <w:pStyle w:val="ListBullet"/>
+        <w:jc w:val="right"/>
+        <w:bidi/>
+      </w:pPr>
+      <w:r>
+        <w:rPr>
+          <w:rtl w:val="1"/>
+        </w:rPr>
+        <w:t>מודל הכנות measured/not-measured (act.md hard laws 1+4): אסור להמציא מספר/מחיר/סטטיסטיקה/ציטוט שלא נשען על דאטה אמיתית; null/available:false = לא נמדד, לא 0. מגן על אמינות הדוחות ללקוח.</w:t>
+      </w:r>
+    </w:p>
+    <w:p>
+      <w:pPr>
+        <w:pStyle w:val="Heading2"/>
+        <w:jc w:val="right"/>
+        <w:bidi/>
+      </w:pPr>
+      <w:r>
+        <w:rPr>
+          <w:rtl w:val="1"/>
+        </w:rPr>
+        <w:t>13.2 מיפוי לפערים הפתוחים ב-Rank</w:t>
+      </w:r>
+    </w:p>
+    <w:tbl>
+      <w:tblPr>
+        <w:tblStyle w:val="LightGrid-Accent1"/>
+        <w:tblW w:type="auto" w:w="0"/>
+        <w:tblLook w:firstColumn="1" w:firstRow="1" w:lastColumn="0" w:lastRow="0" w:noHBand="0" w:noVBand="1" w:val="04A0"/>
+      </w:tblPr>
+      <w:tblGrid>
+        <w:gridCol w:w="2880"/>
+        <w:gridCol w:w="2880"/>
+        <w:gridCol w:w="2880"/>
+      </w:tblGrid>
+      <w:tr>
+        <w:tc>
+          <w:tcPr>
+            <w:tcW w:type="dxa" w:w="2880"/>
+          </w:tcPr>
+          <w:p>
+            <w:pPr>
+              <w:jc w:val="right"/>
+              <w:bidi/>
+            </w:pPr>
+            <w:r>
+              <w:rPr>
+                <w:b/>
+                <w:rtl w:val="1"/>
+              </w:rPr>
+              <w:t>פער פתוח (§3.99)</w:t>
+            </w:r>
+          </w:p>
+        </w:tc>
+        <w:tc>
+          <w:tcPr>
+            <w:tcW w:type="dxa" w:w="2880"/>
+          </w:tcPr>
+          <w:p>
+            <w:pPr>
+              <w:jc w:val="right"/>
+              <w:bidi/>
+            </w:pPr>
+            <w:r>
+              <w:rPr>
+                <w:b/>
+                <w:rtl w:val="1"/>
+              </w:rPr>
+              <w:t>מה seo-god נותן</w:t>
+            </w:r>
+          </w:p>
+        </w:tc>
+        <w:tc>
+          <w:tcPr>
+            <w:tcW w:type="dxa" w:w="2880"/>
+          </w:tcPr>
+          <w:p>
+            <w:pPr>
+              <w:jc w:val="right"/>
+              <w:bidi/>
+            </w:pPr>
+            <w:r>
+              <w:rPr>
+                <w:b/>
+                <w:rtl w:val="1"/>
+              </w:rPr>
+              <w:t>פעולה</w:t>
+            </w:r>
+          </w:p>
+        </w:tc>
+      </w:tr>
+      <w:tr>
+        <w:tc>
+          <w:tcPr>
+            <w:tcW w:type="dxa" w:w="2880"/>
+          </w:tcPr>
+          <w:p>
+            <w:pPr>
+              <w:jc w:val="right"/>
+              <w:bidi/>
+            </w:pPr>
+            <w:r>
+              <w:rPr>
+                <w:rtl w:val="1"/>
+              </w:rPr>
+              <w:t>cron/אוטונומיה</w:t>
+            </w:r>
+          </w:p>
+        </w:tc>
+        <w:tc>
+          <w:tcPr>
+            <w:tcW w:type="dxa" w:w="2880"/>
+          </w:tcPr>
+          <w:p>
+            <w:pPr>
+              <w:jc w:val="right"/>
+              <w:bidi/>
+            </w:pPr>
+            <w:r>
+              <w:rPr>
+                <w:rtl w:val="1"/>
+              </w:rPr>
+              <w:t>לולאת act + סקריפטי scheduler ל-3 OS + deadman self-check (אזהרת 48ש׳)</w:t>
+            </w:r>
+          </w:p>
+        </w:tc>
+        <w:tc>
+          <w:tcPr>
+            <w:tcW w:type="dxa" w:w="2880"/>
+          </w:tcPr>
+          <w:p>
+            <w:pPr>
+              <w:jc w:val="right"/>
+              <w:bidi/>
+            </w:pPr>
+            <w:r>
+              <w:rPr>
+                <w:rtl w:val="1"/>
+              </w:rPr>
+              <w:t>לאמץ את דפוס ה-act loop כ-edge-function cron</w:t>
+            </w:r>
+          </w:p>
+        </w:tc>
+      </w:tr>
+      <w:tr>
+        <w:tc>
+          <w:tcPr>
+            <w:tcW w:type="dxa" w:w="2880"/>
+          </w:tcPr>
+          <w:p>
+            <w:pPr>
+              <w:jc w:val="right"/>
+              <w:bidi/>
+            </w:pPr>
+            <w:r>
+              <w:rPr>
+                <w:rtl w:val="1"/>
+              </w:rPr>
+              <w:t>בוט: approve→publish אמיתי</w:t>
+            </w:r>
+          </w:p>
+        </w:tc>
+        <w:tc>
+          <w:tcPr>
+            <w:tcW w:type="dxa" w:w="2880"/>
+          </w:tcPr>
+          <w:p>
+            <w:pPr>
+              <w:jc w:val="right"/>
+              <w:bidi/>
+            </w:pPr>
+            <w:r>
+              <w:rPr>
+                <w:rtl w:val="1"/>
+              </w:rPr>
+              <w:t>דיסציפלינת build-gate + backup/restore per-batch</w:t>
+            </w:r>
+          </w:p>
+        </w:tc>
+        <w:tc>
+          <w:tcPr>
+            <w:tcW w:type="dxa" w:w="2880"/>
+          </w:tcPr>
+          <w:p>
+            <w:pPr>
+              <w:jc w:val="right"/>
+              <w:bidi/>
+            </w:pPr>
+            <w:r>
+              <w:rPr>
+                <w:rtl w:val="1"/>
+              </w:rPr>
+              <w:t>להשתיל ב-pipeline הפרסום</w:t>
+            </w:r>
+          </w:p>
+        </w:tc>
+      </w:tr>
+      <w:tr>
+        <w:tc>
+          <w:tcPr>
+            <w:tcW w:type="dxa" w:w="2880"/>
+          </w:tcPr>
+          <w:p>
+            <w:pPr>
+              <w:jc w:val="right"/>
+              <w:bidi/>
+            </w:pPr>
+            <w:r>
+              <w:rPr>
+                <w:rtl w:val="1"/>
+              </w:rPr>
+              <w:t>אמינות דוחות</w:t>
+            </w:r>
+          </w:p>
+        </w:tc>
+        <w:tc>
+          <w:tcPr>
+            <w:tcW w:type="dxa" w:w="2880"/>
+          </w:tcPr>
+          <w:p>
+            <w:pPr>
+              <w:jc w:val="right"/>
+              <w:bidi/>
+            </w:pPr>
+            <w:r>
+              <w:rPr>
+                <w:rtl w:val="1"/>
+              </w:rPr>
+              <w:t>honesty model</w:t>
+            </w:r>
+          </w:p>
+        </w:tc>
+        <w:tc>
+          <w:tcPr>
+            <w:tcW w:type="dxa" w:w="2880"/>
+          </w:tcPr>
+          <w:p>
+            <w:pPr>
+              <w:jc w:val="right"/>
+              <w:bidi/>
+            </w:pPr>
+            <w:r>
+              <w:rPr>
+                <w:rtl w:val="1"/>
+              </w:rPr>
+              <w:t>invariant בכל מנועי הדיווח (נרטיב §3.6)</w:t>
+            </w:r>
+          </w:p>
+        </w:tc>
+      </w:tr>
+    </w:tbl>
+    <w:p>
+      <w:pPr>
+        <w:pStyle w:val="Heading2"/>
+        <w:jc w:val="right"/>
+        <w:bidi/>
+      </w:pPr>
+      <w:r>
+        <w:rPr>
+          <w:rtl w:val="1"/>
+        </w:rPr>
+        <w:t>13.3 Power-ups כתבנית (references/power-ups.md)</w:t>
+      </w:r>
+    </w:p>
+    <w:p>
+      <w:pPr>
+        <w:pStyle w:val="ListBullet"/>
+        <w:jc w:val="right"/>
+        <w:bidi/>
+      </w:pPr>
+      <w:r>
+        <w:rPr>
+          <w:rtl w:val="1"/>
+        </w:rPr>
+        <w:t>DataForSEO עם budget-guard: per-run cap + balance floor ($2) + spend ledger לפני הקריאה הראשונה. תבנית ל-§10 (עלות Semrush/Ahrefs). מתעד ש-OpenSEO self-hosted לא מגביל spend — browsing של דשבורד יכול לחייב כסף.</w:t>
+      </w:r>
+    </w:p>
+    <w:p>
+      <w:pPr>
+        <w:pStyle w:val="ListBullet"/>
+        <w:jc w:val="right"/>
+        <w:bidi/>
+      </w:pPr>
+      <w:r>
+        <w:rPr>
+          <w:rtl w:val="1"/>
+        </w:rPr>
+        <w:t>מפתחי LLM ל-AI-visibility ישיר: מבחין proxy / direct-model / direct+browsing עם label נעול בכל readout. תבנית נכונה למדידת Citation Score (§3.5.2) — מגמה, לא מספר מוחלט.</w:t>
+      </w:r>
+    </w:p>
+    <w:p>
+      <w:pPr>
+        <w:pStyle w:val="Heading2"/>
+        <w:jc w:val="right"/>
+        <w:bidi/>
+      </w:pPr>
+      <w:r>
+        <w:rPr>
+          <w:rtl w:val="1"/>
+        </w:rPr>
+        <w:t>13.4 מה לא לקחת</w:t>
+      </w:r>
+    </w:p>
+    <w:p>
+      <w:pPr>
+        <w:pStyle w:val="ListBullet"/>
+        <w:jc w:val="right"/>
+        <w:bidi/>
+      </w:pPr>
+      <w:r>
+        <w:rPr>
+          <w:rtl w:val="1"/>
+        </w:rPr>
+        <w:t>מנוע ה-AI-Visibility שלו חלש מאיתנו — WebSearch גנרי באנגלית על 10 פרומפטים, מודה בעצמו שזה search-proxy ולא ציטוט אמיתי. geo-scan.ts + 7-מנועים (BrightData) + hebrew-seo-geo-toolkit עושים GEO/AEO אמיתי בעברית. לא לדרוס.</w:t>
+      </w:r>
+    </w:p>
+    <w:p>
+      <w:pPr>
+        <w:pStyle w:val="ListBullet"/>
+        <w:jc w:val="right"/>
+        <w:bidi/>
+      </w:pPr>
+      <w:r>
+        <w:rPr>
+          <w:rtl w:val="1"/>
+        </w:rPr>
+        <w:t>התלות ב-OpenSEO/Docker — Rank כבר קורא עם Firecrawl/BrightData. לוקחים את הלוגיקה של ה-loop, לא את ה-crawler.</w:t>
+      </w:r>
+    </w:p>
+    <w:p>
+      <w:pPr>
+        <w:pStyle w:val="Heading2"/>
+        <w:jc w:val="right"/>
+        <w:bidi/>
+      </w:pPr>
+      <w:r>
+        <w:rPr>
+          <w:rtl w:val="1"/>
+        </w:rPr>
+        <w:t>13.5 שילוב בדפי נחיתה (המלצה)</w:t>
+      </w:r>
+    </w:p>
+    <w:p>
+      <w:pPr>
+        <w:pStyle w:val="ListBullet"/>
+        <w:jc w:val="right"/>
+        <w:bidi/>
+      </w:pPr>
+      <w:r>
+        <w:rPr>
+          <w:rtl w:val="1"/>
+        </w:rPr>
+        <w:t>דף GEO Landing (ai-checker): להוסיף מסר honesty-model כ-trust anchor — 'מראים מה נמדד ומה לא נמדד, בלי מספרים מומצאים'. בידול מול כלים שמזייפים ציוני-נראות.</w:t>
+      </w:r>
+    </w:p>
+    <w:p>
+      <w:pPr>
+        <w:pStyle w:val="ListBullet"/>
+        <w:jc w:val="right"/>
+        <w:bidi/>
+      </w:pPr>
+      <w:r>
+        <w:rPr>
+          <w:rtl w:val="1"/>
+        </w:rPr>
+        <w:t>דף מוצר Rank: בלוק 'סוכן שרץ כל בוקר לבד' — מדגים את לולאת ה-act היומית (regressions → quick-wins 4–15 → readout) כפיצ'ר autopilot. הוכחה חיה ל'מוצר שמרוויח בעצמו'.</w:t>
+      </w:r>
+    </w:p>
+    <w:p>
+      <w:pPr>
+        <w:jc w:val="right"/>
+        <w:bidi/>
+      </w:pPr>
+      <w:r>
+        <w:rPr>
+          <w:b/>
+          <w:rtl w:val="1"/>
+        </w:rPr>
+        <w:t>סטטוס POC: ה-skill נבדק במקור (act/schedule/power-ups) והותקן. הרצת audit חי לא בוצעה — דורשת Docker (לא מותקן) והלולאה עורכת קבצים ב-repo; מומלץ להריץ מבוקר על helix-rank או על אתר helix כשלב הבא.</w:t>
+      </w:r>
+    </w:p>
+    <w:p>
+      <w:pPr>
+        <w:pStyle w:val="Heading2"/>
+        <w:jc w:val="right"/>
+        <w:bidi/>
+      </w:pPr>
+      <w:r>
+        <w:rPr>
+          <w:rtl w:val="1"/>
+        </w:rPr>
+        <w:t>13.6 סטטוס: נבנה בפועל ב-helix-rank (2026-08-07)</w:t>
+      </w:r>
+    </w:p>
+    <w:p>
+      <w:pPr>
+        <w:jc w:val="right"/>
+        <w:bidi/>
+      </w:pPr>
+      <w:r>
+        <w:rPr>
+          <w:b/>
+          <w:rtl w:val="1"/>
+        </w:rPr>
+        <w:t>שלושת הרכיבים מומשו כמנוע act אמיתי ב-helix-rank — build + typecheck ירוקים, נדחף ל-origin/main (commit 6e3914e).</w:t>
+      </w:r>
+    </w:p>
+    <w:tbl>
+      <w:tblPr>
+        <w:tblStyle w:val="LightGrid-Accent1"/>
+        <w:tblW w:type="auto" w:w="0"/>
+        <w:tblLook w:firstColumn="1" w:firstRow="1" w:lastColumn="0" w:lastRow="0" w:noHBand="0" w:noVBand="1" w:val="04A0"/>
+      </w:tblPr>
+      <w:tblGrid>
+        <w:gridCol w:w="4320"/>
+        <w:gridCol w:w="4320"/>
+      </w:tblGrid>
+      <w:tr>
+        <w:tc>
+          <w:tcPr>
+            <w:tcW w:type="dxa" w:w="4320"/>
+          </w:tcPr>
+          <w:p>
+            <w:pPr>
+              <w:jc w:val="right"/>
+              <w:bidi/>
+            </w:pPr>
+            <w:r>
+              <w:rPr>
+                <w:b/>
+                <w:rtl w:val="1"/>
+              </w:rPr>
+              <w:t>קובץ</w:t>
+            </w:r>
+          </w:p>
+        </w:tc>
+        <w:tc>
+          <w:tcPr>
+            <w:tcW w:type="dxa" w:w="4320"/>
+          </w:tcPr>
+          <w:p>
+            <w:pPr>
+              <w:jc w:val="right"/>
+              <w:bidi/>
+            </w:pPr>
+            <w:r>
+              <w:rPr>
+                <w:b/>
+                <w:rtl w:val="1"/>
+              </w:rPr>
+              <w:t>תפקיד</w:t>
+            </w:r>
+          </w:p>
+        </w:tc>
+      </w:tr>
+      <w:tr>
+        <w:tc>
+          <w:tcPr>
+            <w:tcW w:type="dxa" w:w="4320"/>
+          </w:tcPr>
+          <w:p>
+            <w:pPr>
+              <w:jc w:val="right"/>
+              <w:bidi/>
+            </w:pPr>
+            <w:r>
+              <w:rPr>
+                <w:rtl w:val="1"/>
+              </w:rPr>
+              <w:t>lib/act/engine.ts</w:t>
+            </w:r>
+          </w:p>
+        </w:tc>
+        <w:tc>
+          <w:tcPr>
+            <w:tcW w:type="dxa" w:w="4320"/>
+          </w:tcPr>
+          <w:p>
+            <w:pPr>
+              <w:jc w:val="right"/>
+              <w:bidi/>
+            </w:pPr>
+            <w:r>
+              <w:rPr>
+                <w:rtl w:val="1"/>
+              </w:rPr>
+              <w:t>לוגיקה טהורה: buildDiff (regressions → quick-wins 4–15 → content-gap) + טיפוסי honesty + מחבר readout עברי ≤15 שורות</w:t>
+            </w:r>
+          </w:p>
+        </w:tc>
+      </w:tr>
+      <w:tr>
+        <w:tc>
+          <w:tcPr>
+            <w:tcW w:type="dxa" w:w="4320"/>
+          </w:tcPr>
+          <w:p>
+            <w:pPr>
+              <w:jc w:val="right"/>
+              <w:bidi/>
+            </w:pPr>
+            <w:r>
+              <w:rPr>
+                <w:rtl w:val="1"/>
+              </w:rPr>
+              <w:t>lib/act/loop.ts</w:t>
+            </w:r>
+          </w:p>
+        </w:tc>
+        <w:tc>
+          <w:tcPr>
+            <w:tcW w:type="dxa" w:w="4320"/>
+          </w:tcPr>
+          <w:p>
+            <w:pPr>
+              <w:jc w:val="right"/>
+              <w:bidi/>
+            </w:pPr>
+            <w:r>
+              <w:rPr>
+                <w:rtl w:val="1"/>
+              </w:rPr>
+              <w:t>orchestrator: snapshot → diff → quick-wins כ-gsc_opportunities → (autopilot) דף אחד מאחורי gate → readout. לא מפרסם live; degrade בכל מקור חסר</w:t>
+            </w:r>
+          </w:p>
+        </w:tc>
+      </w:tr>
+      <w:tr>
+        <w:tc>
+          <w:tcPr>
+            <w:tcW w:type="dxa" w:w="4320"/>
+          </w:tcPr>
+          <w:p>
+            <w:pPr>
+              <w:jc w:val="right"/>
+              <w:bidi/>
+            </w:pPr>
+            <w:r>
+              <w:rPr>
+                <w:rtl w:val="1"/>
+              </w:rPr>
+              <w:t>app/api/act/route.ts</w:t>
+            </w:r>
+          </w:p>
+        </w:tc>
+        <w:tc>
+          <w:tcPr>
+            <w:tcW w:type="dxa" w:w="4320"/>
+          </w:tcPr>
+          <w:p>
+            <w:pPr>
+              <w:jc w:val="right"/>
+              <w:bidi/>
+            </w:pPr>
+            <w:r>
+              <w:rPr>
+                <w:rtl w:val="1"/>
+              </w:rPr>
+              <w:t>endpoint ל-Vercel Cron (?secret=ACT_SECRET, ?site=&lt;id&gt;)</w:t>
+            </w:r>
+          </w:p>
+        </w:tc>
+      </w:tr>
+      <w:tr>
+        <w:tc>
+          <w:tcPr>
+            <w:tcW w:type="dxa" w:w="4320"/>
+          </w:tcPr>
+          <w:p>
+            <w:pPr>
+              <w:jc w:val="right"/>
+              <w:bidi/>
+            </w:pPr>
+            <w:r>
+              <w:rPr>
+                <w:rtl w:val="1"/>
+              </w:rPr>
+              <w:t>migrations/2026-08-07-act-loop.sql</w:t>
+            </w:r>
+          </w:p>
+        </w:tc>
+        <w:tc>
+          <w:tcPr>
+            <w:tcW w:type="dxa" w:w="4320"/>
+          </w:tcPr>
+          <w:p>
+            <w:pPr>
+              <w:jc w:val="right"/>
+              <w:bidi/>
+            </w:pPr>
+            <w:r>
+              <w:rPr>
+                <w:rtl w:val="1"/>
+              </w:rPr>
+              <w:t>טבלאות seo_snapshots + daily_readouts (RLS owner-scoped)</w:t>
+            </w:r>
+          </w:p>
+        </w:tc>
+      </w:tr>
+    </w:tbl>
+    <w:p>
+      <w:pPr>
+        <w:pStyle w:val="ListBullet"/>
+        <w:jc w:val="right"/>
+        <w:bidi/>
+      </w:pPr>
+      <w:r>
+        <w:rPr>
+          <w:rtl w:val="1"/>
+        </w:rPr>
+        <w:t>build-gate: תוכן עם ציון checks &lt; 70 נשאר draft (edited, unverified) — האנלוג ל-batch-restore של seo-god.</w:t>
+      </w:r>
+    </w:p>
+    <w:p>
+      <w:pPr>
+        <w:pStyle w:val="ListBullet"/>
+        <w:jc w:val="right"/>
+        <w:bidi/>
+      </w:pPr>
+      <w:r>
+        <w:rPr>
+          <w:rtl w:val="1"/>
+        </w:rPr>
+        <w:t>honesty: GSC/crawl לא מחוברים → readout כותב 'לא נמדד', לעולם לא 0. עובד גם בלי חיבורים.</w:t>
+      </w:r>
+    </w:p>
+    <w:p>
+      <w:pPr>
+        <w:pStyle w:val="ListBullet"/>
+        <w:jc w:val="right"/>
+        <w:bidi/>
+      </w:pPr>
+      <w:r>
+        <w:rPr>
+          <w:rtl w:val="1"/>
+        </w:rPr>
+        <w:t>נשאר לחווט: Vercel Cron entry, שמירת GSC token ל-site_connections, והרצת המיגרציה ב-Supabase.</w:t>
       </w:r>
     </w:p>
     <w:sectPr>

</xml_diff>